<commit_message>
P-21: fill in @dalwalyk's surname and student ID
Yashi Dalwala, 164054, on the cover page and Table 2 -- the two
placeholders the PR asked each reviewer to fill in. Rebuilt the docx
(node build_midterm_report.js); checked it as a valid zip/OOXML (both
word/document.xml and [Content_Types].xml parse). Full suite 495
passed, ruff clean, check_story_states.py consistent.
Co-Authored-By: Claude Sonnet 5 <noreply@anthropic.com>
</commit_message>
<xml_diff>
--- a/submissions/midterm-report-draft.docx
+++ b/submissions/midterm-report-draft.docx
@@ -262,7 +262,7 @@
                 <w:sz w:val="21"/>
                 <w:szCs w:val="21"/>
               </w:rPr>
-              <w:t xml:space="preserve">Yashi [surname]</w:t>
+              <w:t xml:space="preserve">Yashi Dalwala</w:t>
             </w:r>
           </w:p>
         </w:tc>
@@ -2336,7 +2336,7 @@
                 <w:sz w:val="18"/>
                 <w:szCs w:val="18"/>
               </w:rPr>
-              <w:t xml:space="preserve">Yashi [surname]</w:t>
+              <w:t xml:space="preserve">Yashi Dalwala</w:t>
             </w:r>
           </w:p>
           <w:p>
@@ -2379,7 +2379,7 @@
                 <w:sz w:val="18"/>
                 <w:szCs w:val="18"/>
               </w:rPr>
-              <w:t xml:space="preserve">[ID]</w:t>
+              <w:t xml:space="preserve">164054</w:t>
             </w:r>
           </w:p>
         </w:tc>

</xml_diff>

<commit_message>
P-21: one team list for the cover and Table 2; add @TabeenRaoof's ID
The cover page hard-coded "Student ID: ______" for everyone, while
Table 2 carried IDs in its own strings, so a filled-in ID showed in one
place and not the other (Yashi's appeared only in Table 2). Both now
read one TEAM map of name and student ID. An ID not yet supplied stays
visibly blank: a line on the cover, "[ID]" in Table 2.

Adds @TabeenRaoof's student ID, 163965. Mamadou's surname and ID are
still for @mbj1994 to fill in, in TEAM only. The rebuilt report's text
changes in exactly three places: the two cover IDs and Tabeen's
Table 2 ID.

Co-Authored-By: Claude Opus 5.5 (1M context) <noreply@anthropic.com>
</commit_message>
<xml_diff>
--- a/submissions/midterm-report-draft.docx
+++ b/submissions/midterm-report-draft.docx
@@ -129,7 +129,7 @@
                 <w:sz w:val="21"/>
                 <w:szCs w:val="21"/>
               </w:rPr>
-              <w:t xml:space="preserve">Student ID: ______________</w:t>
+              <w:t xml:space="preserve">Student ID: 163965</w:t>
             </w:r>
           </w:p>
         </w:tc>
@@ -287,7 +287,7 @@
                 <w:sz w:val="21"/>
                 <w:szCs w:val="21"/>
               </w:rPr>
-              <w:t xml:space="preserve">Student ID: ______________</w:t>
+              <w:t xml:space="preserve">Student ID: 164054</w:t>
             </w:r>
           </w:p>
         </w:tc>
@@ -2509,7 +2509,7 @@
                 <w:sz w:val="18"/>
                 <w:szCs w:val="18"/>
               </w:rPr>
-              <w:t xml:space="preserve">[ID]</w:t>
+              <w:t xml:space="preserve">163965</w:t>
             </w:r>
           </w:p>
         </w:tc>

</xml_diff>

<commit_message>
P-21: redraw Figure 13 from the corrected deck timeline
Figure 13 was a crop of the 16 October deck's Gantt chart: Today on
16 October and the capture app drawn as fully done, which its caption
had to disclaim. #165 (P-20) corrected that chart in the deck's own
code. The figure is now cropped from that corrected slide
(scripts/build_midterm_deck.js at f2e8929): Today at 15 October,
the capture app at 11 of 13 and in progress, no done bar past the
cutoff, and the phone-to-service link shown as behind plan.

The caption now describes the chart as it is, without the disclaimer.
It also says plainly what each mark means, since the deck's legend draws
"In progress" as a dashed outline while the bars are solid amber. The
note in P-21 is marked resolved (dated, not deleted). The rebuilt
report differs from the previous build in this caption and this one
image only.

Co-Authored-By: Claude Opus 5.5 (1M context) <noreply@anthropic.com>
</commit_message>
<xml_diff>
--- a/submissions/midterm-report-draft.docx
+++ b/submissions/midterm-report-draft.docx
@@ -9245,9 +9245,9 @@
       <w:r>
         <w:drawing>
           <wp:inline distT="0" distB="0" distL="0" distR="0">
-            <wp:extent cx="5943600" cy="2638425"/>
+            <wp:extent cx="5943600" cy="2762250"/>
             <wp:effectExtent t="0" r="0" b="0" l="0"/>
-            <wp:docPr id="13" name="timeline" descr="Plan versus actual, September to December. Outlined bars are the sprint plan; solid teal bars are completed work; the dashed amber box is the next step on the real-data fixes; dashed red boxes are work that was planned to have started but has not. Di" title="Figure 13"/>
+            <wp:docPr id="13" name="timeline" descr="Plan versus actual, September to December, as of the 15 October cutoff (the dashed Today line). Outlined bars are the sprint plan, with dashed red outlines where that work is behind plan. Solid bars are actual work, none extending past the cutoff: te" title="Figure 13"/>
             <wp:cNvGraphicFramePr>
               <a:graphicFrameLocks xmlns:a="http://schemas.openxmlformats.org/drawingml/2006/main" noChangeAspect="1"/>
             </wp:cNvGraphicFramePr>
@@ -9270,7 +9270,7 @@
                   <pic:spPr bwMode="auto">
                     <a:xfrm>
                       <a:off x="0" y="0"/>
-                      <a:ext cx="5943600" cy="2638425"/>
+                      <a:ext cx="5943600" cy="2762250"/>
                     </a:xfrm>
                     <a:prstGeom prst="rect">
                       <a:avLst/>
@@ -9303,7 +9303,7 @@
           <w:sz w:val="19"/>
           <w:szCs w:val="19"/>
         </w:rPr>
-        <w:t xml:space="preserve">Plan versus actual, September to December. Outlined bars are the sprint plan; solid teal bars are completed work; the dashed amber box is the next step on the real-data fixes; dashed red boxes are work that was planned to have started but has not. Diamonds mark the sprint-gate milestones. (This chart is inherited from the midterm slide deck and has not yet been redrawn for this report’s 15 October cutoff: it still marks Today as 16 October and shows the capture app as fully done through that date. Table 8 and the text in this section are the corrected, cutoff-accurate figures; treat the chart as approximate until it is redrawn.)</w:t>
+        <w:t xml:space="preserve">Plan versus actual, September to December, as of the 15 October cutoff (the dashed Today line). Outlined bars are the sprint plan, with dashed red outlines where that work is behind plan. Solid bars are actual work, none extending past the cutoff: teal is done and amber is in progress. The short red mark on the phone-to-service row is the first real-phone attempt on 15 October (Section 10.3). Diamonds mark the sprint-gate milestones. Cropped from the midterm deck's timeline slide (P-20).</w:t>
       </w:r>
     </w:p>
     <w:p>

</xml_diff>

<commit_message>
P-21: final report: no placeholders left
At @TabeenRaoof's call, to close the report:
- Mamadou's surname and student ID were never supplied, so he appears
  as "Mamadou" with a blank ID line on the cover and an empty ID cell
  in Table 2, not "[surname]" / "[ID]".
- The cover's "Instructor: [instructor name]" and "Submitted: [date]"
  lines are dropped.

P-21's completion record now says @dalwalyk confirmed their 3 h
directly in review, and @mbj1994's 3 h is unconfirmed (D-033). The
rebuilt report changes in exactly these places; no placeholder or local
path remains.

Co-Authored-By: Claude Opus 5.5 (1M context) <noreply@anthropic.com>
</commit_message>
<xml_diff>
--- a/submissions/midterm-report-draft.docx
+++ b/submissions/midterm-report-draft.docx
@@ -183,7 +183,7 @@
                 <w:sz w:val="21"/>
                 <w:szCs w:val="21"/>
               </w:rPr>
-              <w:t xml:space="preserve">Mamadou [surname]</w:t>
+              <w:t xml:space="preserve">Mamadou</w:t>
             </w:r>
           </w:p>
         </w:tc>
@@ -329,32 +329,6 @@
           <w:szCs w:val="22"/>
         </w:rPr>
         <w:t xml:space="preserve">San Francisco Bay University · Fall 2026</w:t>
-      </w:r>
-    </w:p>
-    <w:p>
-      <w:pPr>
-        <w:spacing w:after="60"/>
-      </w:pPr>
-      <w:r>
-        <w:rPr>
-          <w:color w:val="1A2326"/>
-          <w:sz w:val="22"/>
-          <w:szCs w:val="22"/>
-        </w:rPr>
-        <w:t xml:space="preserve">Instructor: [instructor name]</w:t>
-      </w:r>
-    </w:p>
-    <w:p>
-      <w:pPr>
-        <w:spacing w:after="60"/>
-      </w:pPr>
-      <w:r>
-        <w:rPr>
-          <w:color w:val="1A2326"/>
-          <w:sz w:val="22"/>
-          <w:szCs w:val="22"/>
-        </w:rPr>
-        <w:t xml:space="preserve">Submitted: [date], October 2026</w:t>
       </w:r>
     </w:p>
     <w:p>
@@ -2207,7 +2181,7 @@
                 <w:sz w:val="18"/>
                 <w:szCs w:val="18"/>
               </w:rPr>
-              <w:t xml:space="preserve">Mamadou [surname]</w:t>
+              <w:t xml:space="preserve">Mamadou</w:t>
             </w:r>
           </w:p>
           <w:p>
@@ -2241,16 +2215,6 @@
             <w:pPr>
               <w:spacing w:after="0" w:before="0" w:line="252"/>
             </w:pPr>
-            <w:r>
-              <w:rPr>
-                <w:b w:val="false"/>
-                <w:bCs w:val="false"/>
-                <w:color w:val="1A2326"/>
-                <w:sz w:val="18"/>
-                <w:szCs w:val="18"/>
-              </w:rPr>
-              <w:t xml:space="preserve">[ID]</w:t>
-            </w:r>
           </w:p>
         </w:tc>
         <w:tc>

</xml_diff>